<commit_message>
Adding word2vec and categorical regression
</commit_message>
<xml_diff>
--- a/7-16 Summer Project.docx
+++ b/7-16 Summer Project.docx
@@ -323,7 +323,15 @@
         </w:numPr>
       </w:pPr>
       <w:r>
-        <w:t>Feature selection model: selects at most n features if you have n observations, all other feature coefficients will go to 0</w:t>
+        <w:t xml:space="preserve">Feature selection </w:t>
+      </w:r>
+      <w:proofErr w:type="gramStart"/>
+      <w:r>
+        <w:t>model:</w:t>
+      </w:r>
+      <w:proofErr w:type="gramEnd"/>
+      <w:r>
+        <w:t xml:space="preserve"> selects at most n features if you have n observations, all other feature coefficients will go to 0</w:t>
       </w:r>
     </w:p>
     <w:p>
@@ -398,7 +406,15 @@
         </w:numPr>
       </w:pPr>
       <w:r>
-        <w:t>Good to use: when you want to select a subset of features or believe that only certain features in your model have predictive importance</w:t>
+        <w:t xml:space="preserve">Good to </w:t>
+      </w:r>
+      <w:proofErr w:type="gramStart"/>
+      <w:r>
+        <w:t>use:</w:t>
+      </w:r>
+      <w:proofErr w:type="gramEnd"/>
+      <w:r>
+        <w:t xml:space="preserve"> when you want to select a subset of features or believe that only certain features in your model have predictive importance</w:t>
       </w:r>
       <w:r>
         <w:t>, when your data has significant outliers</w:t>
@@ -462,7 +478,15 @@
         </w:numPr>
       </w:pPr>
       <w:r>
-        <w:t>Good to use: when you believe all your features may be important or do not want to perform feature selection</w:t>
+        <w:t xml:space="preserve">Good to </w:t>
+      </w:r>
+      <w:proofErr w:type="gramStart"/>
+      <w:r>
+        <w:t>use:</w:t>
+      </w:r>
+      <w:proofErr w:type="gramEnd"/>
+      <w:r>
+        <w:t xml:space="preserve"> when you believe all your features may be important or do not want to perform feature selection</w:t>
       </w:r>
       <w:r>
         <w:t>, when your data has noise but not significant outliers</w:t>
@@ -531,7 +555,15 @@
         </w:numPr>
       </w:pPr>
       <w:r>
-        <w:t>Good to use: when you believe certain features in your model have predictive importance but want to be robust against bias when selecting among collinear variables</w:t>
+        <w:t xml:space="preserve">Good to </w:t>
+      </w:r>
+      <w:proofErr w:type="gramStart"/>
+      <w:r>
+        <w:t>use:</w:t>
+      </w:r>
+      <w:proofErr w:type="gramEnd"/>
+      <w:r>
+        <w:t xml:space="preserve"> when you believe certain features in your model have predictive importance but want to be robust against bias when selecting among collinear variables</w:t>
       </w:r>
       <w:r>
         <w:t>, when your data may have significant outliers</w:t>
@@ -554,14 +586,78 @@
           <w:i/>
           <w:iCs/>
         </w:rPr>
-        <w:t>When dataset is larger than 100K rows, use SGDRegressor with ‘elastic net’, ‘lasso’, ‘ridge’ parameters</w:t>
-      </w:r>
+        <w:t xml:space="preserve">When dataset is larger than 100K rows, use </w:t>
+      </w:r>
+      <w:proofErr w:type="spellStart"/>
       <w:r>
         <w:rPr>
           <w:i/>
           <w:iCs/>
         </w:rPr>
-        <w:t xml:space="preserve"> rather than ElasticNet, LassoRegression, RidgeRegression functions directly</w:t>
+        <w:t>SGDRegressor</w:t>
+      </w:r>
+      <w:proofErr w:type="spellEnd"/>
+      <w:r>
+        <w:rPr>
+          <w:i/>
+          <w:iCs/>
+        </w:rPr>
+        <w:t xml:space="preserve"> with ‘elastic net’, ‘lasso’, ‘ridge’ parameters</w:t>
+      </w:r>
+      <w:r>
+        <w:rPr>
+          <w:i/>
+          <w:iCs/>
+        </w:rPr>
+        <w:t xml:space="preserve"> rather than </w:t>
+      </w:r>
+      <w:proofErr w:type="spellStart"/>
+      <w:r>
+        <w:rPr>
+          <w:i/>
+          <w:iCs/>
+        </w:rPr>
+        <w:t>ElasticNet</w:t>
+      </w:r>
+      <w:proofErr w:type="spellEnd"/>
+      <w:r>
+        <w:rPr>
+          <w:i/>
+          <w:iCs/>
+        </w:rPr>
+        <w:t xml:space="preserve">, </w:t>
+      </w:r>
+      <w:proofErr w:type="spellStart"/>
+      <w:r>
+        <w:rPr>
+          <w:i/>
+          <w:iCs/>
+        </w:rPr>
+        <w:t>LassoRegression</w:t>
+      </w:r>
+      <w:proofErr w:type="spellEnd"/>
+      <w:r>
+        <w:rPr>
+          <w:i/>
+          <w:iCs/>
+        </w:rPr>
+        <w:t xml:space="preserve">, </w:t>
+      </w:r>
+      <w:proofErr w:type="spellStart"/>
+      <w:r>
+        <w:rPr>
+          <w:i/>
+          <w:iCs/>
+        </w:rPr>
+        <w:t>RidgeRegression</w:t>
+      </w:r>
+      <w:proofErr w:type="spellEnd"/>
+      <w:r>
+        <w:rPr>
+          <w:i/>
+          <w:iCs/>
+        </w:rPr>
+        <w:t xml:space="preserve"> functions directly</w:t>
       </w:r>
     </w:p>
     <w:p>
@@ -621,7 +717,31 @@
         </w:numPr>
       </w:pPr>
       <w:r>
-        <w:t>Do we want high predictive accuracy for our model? Then a tree-based model like CatBoost or XGBoost might be better as there are less model assumptions</w:t>
+        <w:t xml:space="preserve">Do we want high predictive accuracy for our model? Then a tree-based model like </w:t>
+      </w:r>
+      <w:proofErr w:type="spellStart"/>
+      <w:r>
+        <w:t>CatBoost</w:t>
+      </w:r>
+      <w:proofErr w:type="spellEnd"/>
+      <w:r>
+        <w:t xml:space="preserve"> or </w:t>
+      </w:r>
+      <w:proofErr w:type="spellStart"/>
+      <w:r>
+        <w:t>XGBoost</w:t>
+      </w:r>
+      <w:proofErr w:type="spellEnd"/>
+      <w:r>
+        <w:t xml:space="preserve"> might be better as there are </w:t>
+      </w:r>
+      <w:proofErr w:type="gramStart"/>
+      <w:r>
+        <w:t>less</w:t>
+      </w:r>
+      <w:proofErr w:type="gramEnd"/>
+      <w:r>
+        <w:t xml:space="preserve"> model assumptions</w:t>
       </w:r>
     </w:p>
     <w:p>
@@ -777,8 +897,13 @@
         </w:numPr>
       </w:pPr>
       <w:r>
-        <w:t>If dataset greater than 100K rows, use SGDRegressor</w:t>
-      </w:r>
+        <w:t xml:space="preserve">If dataset greater than 100K rows, use </w:t>
+      </w:r>
+      <w:proofErr w:type="spellStart"/>
+      <w:r>
+        <w:t>SGDRegressor</w:t>
+      </w:r>
+      <w:proofErr w:type="spellEnd"/>
     </w:p>
     <w:p>
       <w:pPr>
@@ -889,12 +1014,28 @@
     </w:p>
     <w:p>
       <w:r>
-        <w:t>Without outliers, Ridge Regression and Elastic Net do the best.</w:t>
-      </w:r>
-    </w:p>
-    <w:p>
-      <w:r>
-        <w:t xml:space="preserve">With outliers, Huber controlled for multicollinearity typically </w:t>
+        <w:t xml:space="preserve">Without outliers, Ridge Regression and Elastic Net do </w:t>
+      </w:r>
+      <w:proofErr w:type="gramStart"/>
+      <w:r>
+        <w:t>the</w:t>
+      </w:r>
+      <w:proofErr w:type="gramEnd"/>
+      <w:r>
+        <w:t xml:space="preserve"> best.</w:t>
+      </w:r>
+    </w:p>
+    <w:p>
+      <w:r>
+        <w:t xml:space="preserve">With outliers, Huber </w:t>
+      </w:r>
+      <w:proofErr w:type="gramStart"/>
+      <w:r>
+        <w:t>controlled for</w:t>
+      </w:r>
+      <w:proofErr w:type="gramEnd"/>
+      <w:r>
+        <w:t xml:space="preserve"> multicollinearity typically </w:t>
       </w:r>
       <w:r>
         <w:t>do</w:t>
@@ -955,18 +1096,115 @@
     </w:p>
     <w:p>
       <w:r>
-        <w:t>If we want to keep the outliers? Huber with VIF.</w:t>
-      </w:r>
-    </w:p>
-    <w:p>
-      <w:r>
-        <w:t xml:space="preserve">If we want to keep all features? </w:t>
-      </w:r>
-      <w:r>
-        <w:t>R</w:t>
-      </w:r>
-      <w:r>
-        <w:t>un Ridge Regression</w:t>
+        <w:t>Outliers may be important, so we shouldn’t arbitrarily drop them. Better to run the model with and without outliers and compare the results.</w:t>
+      </w:r>
+    </w:p>
+    <w:p>
+      <w:r>
+        <w:t xml:space="preserve">In practice, Elastic Net is often used over Lasso and Ridge regression because with the right parameters it </w:t>
+      </w:r>
+      <w:r>
+        <w:t>becomes</w:t>
+      </w:r>
+      <w:r>
+        <w:t xml:space="preserve"> Lasso and Ridge regression.</w:t>
+      </w:r>
+      <w:r>
+        <w:t xml:space="preserve"> </w:t>
+      </w:r>
+      <w:r>
+        <w:t xml:space="preserve">It’s also </w:t>
+      </w:r>
+      <w:proofErr w:type="gramStart"/>
+      <w:r>
+        <w:t>fairly robust</w:t>
+      </w:r>
+      <w:proofErr w:type="gramEnd"/>
+      <w:r>
+        <w:t xml:space="preserve"> to outliers. </w:t>
+      </w:r>
+      <w:r>
+        <w:t>Overall, would select Elastic Net unless some of these edge cases are specified by the user.</w:t>
+      </w:r>
+    </w:p>
+    <w:p/>
+    <w:p>
+      <w:pPr>
+        <w:rPr>
+          <w:i/>
+          <w:iCs/>
+        </w:rPr>
+      </w:pPr>
+      <w:r>
+        <w:rPr>
+          <w:i/>
+          <w:iCs/>
+        </w:rPr>
+        <w:t xml:space="preserve">If we want to keep the outliers? </w:t>
+      </w:r>
+    </w:p>
+    <w:p>
+      <w:r>
+        <w:t>Huber with VIF</w:t>
+      </w:r>
+      <w:r>
+        <w:t>: stable, better accuracy</w:t>
+      </w:r>
+    </w:p>
+    <w:p>
+      <w:r>
+        <w:t>Randomized Lasso</w:t>
+      </w:r>
+      <w:r>
+        <w:t>: removes features that don’t contribute to the prediction - not just those that are highly multicollinear</w:t>
+      </w:r>
+    </w:p>
+    <w:p>
+      <w:pPr>
+        <w:rPr>
+          <w:i/>
+          <w:iCs/>
+        </w:rPr>
+      </w:pPr>
+      <w:r>
+        <w:rPr>
+          <w:i/>
+          <w:iCs/>
+        </w:rPr>
+        <w:t>If we want to keep all features</w:t>
+      </w:r>
+      <w:r>
+        <w:rPr>
+          <w:i/>
+          <w:iCs/>
+        </w:rPr>
+        <w:t xml:space="preserve"> </w:t>
+      </w:r>
+      <w:r>
+        <w:rPr>
+          <w:i/>
+          <w:iCs/>
+        </w:rPr>
+        <w:t xml:space="preserve">but are worried about </w:t>
+      </w:r>
+      <w:r>
+        <w:rPr>
+          <w:i/>
+          <w:iCs/>
+        </w:rPr>
+        <w:t>multicollinearity</w:t>
+      </w:r>
+      <w:r>
+        <w:rPr>
+          <w:i/>
+          <w:iCs/>
+        </w:rPr>
+        <w:t xml:space="preserve">? </w:t>
+      </w:r>
+    </w:p>
+    <w:p>
+      <w:r>
+        <w:t>Ridge Regression</w:t>
       </w:r>
       <w:r>
         <w:t xml:space="preserve"> (note that it is susceptible to outliers)</w:t>
@@ -976,25 +1214,82 @@
       </w:r>
     </w:p>
     <w:p>
-      <w:r>
-        <w:t xml:space="preserve">If we are worried about multicollinearity but okay with dropping some features? Run Randomized Lasso, Elastic Net (if we anticipate significant outliers). </w:t>
-      </w:r>
-      <w:r>
-        <w:t>Can also r</w:t>
-      </w:r>
-      <w:r>
-        <w:t>un Linear Regression w/ VIF (if we do</w:t>
-      </w:r>
-      <w:r>
-        <w:t>n’t</w:t>
-      </w:r>
-      <w:r>
-        <w:t xml:space="preserve"> anticipate significant outliers). </w:t>
-      </w:r>
-    </w:p>
-    <w:p>
-      <w:r>
-        <w:t xml:space="preserve">If we have more predictors than observations? Run Ridge, Randomized Lasso, or Elastic Net. </w:t>
+      <w:pPr>
+        <w:rPr>
+          <w:i/>
+          <w:iCs/>
+        </w:rPr>
+      </w:pPr>
+      <w:r>
+        <w:rPr>
+          <w:i/>
+          <w:iCs/>
+        </w:rPr>
+        <w:t xml:space="preserve">If we are worried about multicollinearity but okay with dropping some features? </w:t>
+      </w:r>
+    </w:p>
+    <w:p>
+      <w:r>
+        <w:t>Randomized Lasso</w:t>
+      </w:r>
+      <w:r>
+        <w:t>: handles outliers, doesn’t change signs w/ highly multicollinear variables</w:t>
+      </w:r>
+    </w:p>
+    <w:p>
+      <w:r>
+        <w:t>Elastic Net</w:t>
+      </w:r>
+      <w:r>
+        <w:t>: selects more features, more stable, handles outliers, selects more than one multicollinear variable from group</w:t>
+      </w:r>
+    </w:p>
+    <w:p>
+      <w:r>
+        <w:t>Linear Regression w/ VIF: stable (note that it is susceptible to outliers)</w:t>
+      </w:r>
+    </w:p>
+    <w:p>
+      <w:pPr>
+        <w:rPr>
+          <w:i/>
+          <w:iCs/>
+        </w:rPr>
+      </w:pPr>
+      <w:r>
+        <w:rPr>
+          <w:i/>
+          <w:iCs/>
+        </w:rPr>
+        <w:lastRenderedPageBreak/>
+        <w:t xml:space="preserve">If we have more predictors than observations? </w:t>
+      </w:r>
+    </w:p>
+    <w:p>
+      <w:r>
+        <w:t>Ridge</w:t>
+      </w:r>
+      <w:r>
+        <w:t>: selects all features (stable)</w:t>
+      </w:r>
+      <w:r>
+        <w:t>, outperforms lasso with high multicollinearity</w:t>
+      </w:r>
+    </w:p>
+    <w:p>
+      <w:r>
+        <w:t>Randomized Lasso</w:t>
+      </w:r>
+      <w:r>
+        <w:t>: handles outliers</w:t>
+      </w:r>
+    </w:p>
+    <w:p>
+      <w:r>
+        <w:t>Elastic Net</w:t>
+      </w:r>
+      <w:r>
+        <w:t>: handles outliers, more stable than lasso, selects more than one multicollinear variable from group</w:t>
       </w:r>
     </w:p>
     <w:p/>
@@ -1003,39 +1298,45 @@
         <w:rPr>
           <w:b/>
           <w:bCs/>
-        </w:rPr>
-      </w:pPr>
+          <w:lang w:val="es-ES"/>
+        </w:rPr>
+      </w:pPr>
+      <w:proofErr w:type="spellStart"/>
       <w:r>
         <w:rPr>
           <w:b/>
           <w:bCs/>
-        </w:rPr>
-        <w:t>LLMs:</w:t>
-      </w:r>
-    </w:p>
-    <w:p>
-      <w:pPr>
-        <w:rPr>
           <w:lang w:val="es-ES"/>
         </w:rPr>
-      </w:pPr>
-      <w:r>
-        <w:rPr>
+        <w:t>LLMs</w:t>
+      </w:r>
+      <w:proofErr w:type="spellEnd"/>
+      <w:r>
+        <w:rPr>
+          <w:b/>
+          <w:bCs/>
           <w:lang w:val="es-ES"/>
         </w:rPr>
+        <w:t>:</w:t>
+      </w:r>
+    </w:p>
+    <w:p>
+      <w:pPr>
+        <w:rPr>
+          <w:lang w:val="es-ES"/>
+        </w:rPr>
+      </w:pPr>
+      <w:r>
+        <w:rPr>
+          <w:lang w:val="es-ES"/>
+        </w:rPr>
         <w:t>GPT 4o:</w:t>
       </w:r>
       <w:r>
         <w:rPr>
           <w:lang w:val="es-ES"/>
         </w:rPr>
-        <w:t xml:space="preserve"> </w:t>
-      </w:r>
-      <w:r>
-        <w:rPr>
-          <w:lang w:val="es-ES"/>
-        </w:rPr>
-        <w:t>https://chatgpt.com/share/d050cd17-4d27-4c65-8f36-1c8e5eabfa03</w:t>
+        <w:t xml:space="preserve"> https://chatgpt.com/share/d050cd17-4d27-4c65-8f36-1c8e5eabfa03</w:t>
       </w:r>
     </w:p>
     <w:p>
@@ -1117,182 +1418,999 @@
         </w:numPr>
       </w:pPr>
       <w:r>
-        <w:t>After prompting it does pretty well but need to specify the steps and considerations ahead of time</w:t>
-      </w:r>
-    </w:p>
-    <w:p>
+        <w:t xml:space="preserve">After prompting it does </w:t>
+      </w:r>
+      <w:proofErr w:type="gramStart"/>
+      <w:r>
+        <w:t>pretty well</w:t>
+      </w:r>
+      <w:proofErr w:type="gramEnd"/>
+      <w:r>
+        <w:t xml:space="preserve"> but need to specify the steps and considerations ahead of time</w:t>
+      </w:r>
+    </w:p>
+    <w:p>
+      <w:r>
+        <w:t>Julius:</w:t>
+      </w:r>
+    </w:p>
+    <w:p>
+      <w:pPr>
+        <w:pStyle w:val="ListParagraph"/>
+        <w:numPr>
+          <w:ilvl w:val="0"/>
+          <w:numId w:val="1"/>
+        </w:numPr>
+      </w:pPr>
+      <w:r>
+        <w:t>Checks for multicollinearity, outliers, etc. while using a vanilla OLS model</w:t>
+      </w:r>
+    </w:p>
+    <w:p>
+      <w:pPr>
+        <w:pStyle w:val="ListParagraph"/>
+        <w:numPr>
+          <w:ilvl w:val="1"/>
+          <w:numId w:val="1"/>
+        </w:numPr>
+      </w:pPr>
+      <w:r>
+        <w:t xml:space="preserve">Uses </w:t>
+      </w:r>
+      <w:proofErr w:type="spellStart"/>
+      <w:r>
+        <w:t>statsmodels</w:t>
+      </w:r>
+      <w:proofErr w:type="spellEnd"/>
+      <w:r>
+        <w:t xml:space="preserve"> OLS so there isn’t a way to do the train/test split before checking for all of this</w:t>
+      </w:r>
+    </w:p>
+    <w:p>
+      <w:pPr>
+        <w:pStyle w:val="ListParagraph"/>
+        <w:numPr>
+          <w:ilvl w:val="0"/>
+          <w:numId w:val="1"/>
+        </w:numPr>
+      </w:pPr>
+      <w:r>
+        <w:t>Goes to Random Forest first before interpretability consideration is explained</w:t>
+      </w:r>
+    </w:p>
+    <w:p>
+      <w:r>
+        <w:t>Copilot:</w:t>
+      </w:r>
+    </w:p>
+    <w:p>
+      <w:pPr>
+        <w:pStyle w:val="ListParagraph"/>
+        <w:numPr>
+          <w:ilvl w:val="0"/>
+          <w:numId w:val="1"/>
+        </w:numPr>
+      </w:pPr>
+      <w:r>
+        <w:t>Also initially selects Random Forest</w:t>
+      </w:r>
+    </w:p>
+    <w:p>
+      <w:pPr>
+        <w:pStyle w:val="ListParagraph"/>
+        <w:numPr>
+          <w:ilvl w:val="0"/>
+          <w:numId w:val="1"/>
+        </w:numPr>
+      </w:pPr>
+      <w:r>
+        <w:t xml:space="preserve">Then chooses linear or lasso regression </w:t>
+      </w:r>
+    </w:p>
+    <w:p>
+      <w:pPr>
+        <w:pStyle w:val="ListParagraph"/>
+        <w:numPr>
+          <w:ilvl w:val="0"/>
+          <w:numId w:val="1"/>
+        </w:numPr>
+      </w:pPr>
+      <w:r>
+        <w:t>Depending on my prompt, gives the correct regression model response</w:t>
+      </w:r>
+    </w:p>
+    <w:p/>
+    <w:p>
+      <w:r>
+        <w:t>Encoding categorical features:</w:t>
+      </w:r>
+    </w:p>
+    <w:p>
+      <w:pPr>
+        <w:pStyle w:val="ListParagraph"/>
+        <w:numPr>
+          <w:ilvl w:val="0"/>
+          <w:numId w:val="1"/>
+        </w:numPr>
+        <w:rPr>
+          <w:i/>
+          <w:iCs/>
+        </w:rPr>
+      </w:pPr>
+      <w:r>
+        <w:rPr>
+          <w:i/>
+          <w:iCs/>
+        </w:rPr>
+        <w:t xml:space="preserve">Feature selection: </w:t>
+      </w:r>
+      <w:proofErr w:type="spellStart"/>
+      <w:r>
+        <w:rPr>
+          <w:i/>
+          <w:iCs/>
+        </w:rPr>
+        <w:t>SelectKBest</w:t>
+      </w:r>
+      <w:proofErr w:type="spellEnd"/>
+      <w:r>
+        <w:rPr>
+          <w:i/>
+          <w:iCs/>
+        </w:rPr>
+        <w:t xml:space="preserve"> can help choose a subset of features… or PCA could be used for dimensionality reduction</w:t>
+      </w:r>
+    </w:p>
+    <w:p>
+      <w:pPr>
+        <w:pStyle w:val="ListParagraph"/>
+        <w:numPr>
+          <w:ilvl w:val="0"/>
+          <w:numId w:val="1"/>
+        </w:numPr>
+      </w:pPr>
+      <w:r>
+        <w:t>Issue: many categories in your data</w:t>
+      </w:r>
+    </w:p>
+    <w:p>
+      <w:pPr>
+        <w:pStyle w:val="ListParagraph"/>
+        <w:numPr>
+          <w:ilvl w:val="0"/>
+          <w:numId w:val="1"/>
+        </w:numPr>
+      </w:pPr>
+      <w:r>
+        <w:t>Group rare categories into “other” bucket</w:t>
+      </w:r>
+    </w:p>
+    <w:p>
+      <w:pPr>
+        <w:pStyle w:val="ListParagraph"/>
+        <w:numPr>
+          <w:ilvl w:val="1"/>
+          <w:numId w:val="1"/>
+        </w:numPr>
+      </w:pPr>
+      <w:r>
+        <w:t>Prevents overfitting</w:t>
+      </w:r>
+    </w:p>
+    <w:p>
+      <w:pPr>
+        <w:pStyle w:val="ListParagraph"/>
+        <w:numPr>
+          <w:ilvl w:val="0"/>
+          <w:numId w:val="1"/>
+        </w:numPr>
+      </w:pPr>
+      <w:r>
+        <w:t xml:space="preserve">Use </w:t>
+      </w:r>
+      <w:proofErr w:type="spellStart"/>
+      <w:r>
+        <w:t>CatBoost</w:t>
+      </w:r>
+      <w:proofErr w:type="spellEnd"/>
+      <w:r>
+        <w:t xml:space="preserve"> encoder to turn categorical variables into continuous ones</w:t>
+      </w:r>
+      <w:r>
+        <w:t xml:space="preserve"> (Target Encoder that mitigates the target leakage from a typical Target Encoder process)</w:t>
+      </w:r>
+    </w:p>
+    <w:p>
+      <w:pPr>
+        <w:pStyle w:val="ListParagraph"/>
+        <w:numPr>
+          <w:ilvl w:val="1"/>
+          <w:numId w:val="1"/>
+        </w:numPr>
+      </w:pPr>
       <w:r>
         <w:lastRenderedPageBreak/>
-        <w:t>Julius:</w:t>
-      </w:r>
-    </w:p>
-    <w:p>
-      <w:pPr>
-        <w:pStyle w:val="ListParagraph"/>
-        <w:numPr>
-          <w:ilvl w:val="0"/>
-          <w:numId w:val="1"/>
-        </w:numPr>
-      </w:pPr>
-      <w:r>
-        <w:t>Checks for multicollinearity, outliers, etc. while using a vanilla OLS model</w:t>
-      </w:r>
-    </w:p>
-    <w:p>
-      <w:pPr>
-        <w:pStyle w:val="ListParagraph"/>
-        <w:numPr>
-          <w:ilvl w:val="1"/>
-          <w:numId w:val="1"/>
-        </w:numPr>
-      </w:pPr>
-      <w:r>
-        <w:t>Uses statsmodels OLS so there isn’t a way to do the train/test split before checking for all of this</w:t>
-      </w:r>
-    </w:p>
-    <w:p>
-      <w:pPr>
-        <w:pStyle w:val="ListParagraph"/>
-        <w:numPr>
-          <w:ilvl w:val="0"/>
-          <w:numId w:val="1"/>
-        </w:numPr>
-      </w:pPr>
-      <w:r>
-        <w:t>Goes to Random Forest first before interpretability consideration is explained</w:t>
-      </w:r>
-    </w:p>
-    <w:p>
-      <w:r>
-        <w:t>Copilot:</w:t>
-      </w:r>
-    </w:p>
-    <w:p>
-      <w:pPr>
-        <w:pStyle w:val="ListParagraph"/>
-        <w:numPr>
-          <w:ilvl w:val="0"/>
-          <w:numId w:val="1"/>
-        </w:numPr>
-      </w:pPr>
-      <w:r>
-        <w:t>Also initially selects Random Forest</w:t>
-      </w:r>
-    </w:p>
-    <w:p>
-      <w:pPr>
-        <w:pStyle w:val="ListParagraph"/>
-        <w:numPr>
-          <w:ilvl w:val="0"/>
-          <w:numId w:val="1"/>
-        </w:numPr>
-      </w:pPr>
-      <w:r>
-        <w:t xml:space="preserve">Then chooses linear or lasso regression </w:t>
-      </w:r>
-    </w:p>
-    <w:p>
-      <w:pPr>
-        <w:pStyle w:val="ListParagraph"/>
-        <w:numPr>
-          <w:ilvl w:val="0"/>
-          <w:numId w:val="1"/>
-        </w:numPr>
-      </w:pPr>
-      <w:r>
-        <w:t>Depending on my prompt, gives the correct regression model response</w:t>
+        <w:t xml:space="preserve">This eliminates the space issue of one-hot </w:t>
+      </w:r>
+      <w:proofErr w:type="gramStart"/>
+      <w:r>
+        <w:t>encoding</w:t>
+      </w:r>
+      <w:proofErr w:type="gramEnd"/>
+      <w:r>
+        <w:t xml:space="preserve"> but </w:t>
+      </w:r>
+      <w:r>
+        <w:rPr>
+          <w:b/>
+          <w:bCs/>
+        </w:rPr>
+        <w:t>it doesn’t necessarily tell us which subcategories are the most impactful</w:t>
+      </w:r>
+      <w:r>
+        <w:rPr>
+          <w:b/>
+          <w:bCs/>
+        </w:rPr>
+        <w:t xml:space="preserve"> – will continue doing research on this</w:t>
+      </w:r>
+    </w:p>
+    <w:p>
+      <w:pPr>
+        <w:pStyle w:val="ListParagraph"/>
+        <w:numPr>
+          <w:ilvl w:val="1"/>
+          <w:numId w:val="1"/>
+        </w:numPr>
+      </w:pPr>
+      <w:r>
+        <w:t>One-hot encoding is the best performance wise on multiclass datasets but there is no discernable difference between target encoding and one-hot encoding in binomial settings</w:t>
+      </w:r>
+    </w:p>
+    <w:p>
+      <w:pPr>
+        <w:pStyle w:val="ListParagraph"/>
+        <w:numPr>
+          <w:ilvl w:val="0"/>
+          <w:numId w:val="1"/>
+        </w:numPr>
+      </w:pPr>
+      <w:r>
+        <w:t>Treat ordinal variables as continuous variables</w:t>
+      </w:r>
+    </w:p>
+    <w:p>
+      <w:r>
+        <w:t>----------------------------------------</w:t>
+      </w:r>
+    </w:p>
+    <w:p>
+      <w:r>
+        <w:t>Steps for adding categorical variables:</w:t>
+      </w:r>
+    </w:p>
+    <w:p>
+      <w:pPr>
+        <w:pStyle w:val="ListParagraph"/>
+        <w:numPr>
+          <w:ilvl w:val="0"/>
+          <w:numId w:val="1"/>
+        </w:numPr>
+      </w:pPr>
+      <w:r>
+        <w:t xml:space="preserve">Can either group rare categories into </w:t>
+      </w:r>
+      <w:proofErr w:type="gramStart"/>
+      <w:r>
+        <w:t>an “other”</w:t>
+      </w:r>
+      <w:proofErr w:type="gramEnd"/>
+      <w:r>
+        <w:t xml:space="preserve"> bucket or not – no clear way to discern whether one option is better, perhaps best to run both and see which has better results</w:t>
+      </w:r>
+    </w:p>
+    <w:p>
+      <w:pPr>
+        <w:pStyle w:val="ListParagraph"/>
+        <w:numPr>
+          <w:ilvl w:val="1"/>
+          <w:numId w:val="1"/>
+        </w:numPr>
+      </w:pPr>
+      <w:r>
+        <w:t xml:space="preserve">In the </w:t>
+      </w:r>
+      <w:proofErr w:type="spellStart"/>
+      <w:r>
+        <w:t>AirBNB</w:t>
+      </w:r>
+      <w:proofErr w:type="spellEnd"/>
+      <w:r>
+        <w:t xml:space="preserve"> dataset, it didn’t help</w:t>
+      </w:r>
+      <w:r>
+        <w:t xml:space="preserve"> (reduced accuracy by 5-7%) – in this case, other category had meaningful information</w:t>
+      </w:r>
+    </w:p>
+    <w:p>
+      <w:pPr>
+        <w:pStyle w:val="ListParagraph"/>
+        <w:numPr>
+          <w:ilvl w:val="0"/>
+          <w:numId w:val="1"/>
+        </w:numPr>
+      </w:pPr>
+      <w:r>
+        <w:t xml:space="preserve">Use </w:t>
+      </w:r>
+      <w:proofErr w:type="spellStart"/>
+      <w:r>
+        <w:t>CatBoost</w:t>
+      </w:r>
+      <w:proofErr w:type="spellEnd"/>
+      <w:r>
+        <w:t xml:space="preserve"> encoder to turn categorical variables into continuous ones</w:t>
+      </w:r>
+    </w:p>
+    <w:p>
+      <w:pPr>
+        <w:pStyle w:val="ListParagraph"/>
+        <w:numPr>
+          <w:ilvl w:val="1"/>
+          <w:numId w:val="1"/>
+        </w:numPr>
+      </w:pPr>
+      <w:proofErr w:type="spellStart"/>
+      <w:r>
+        <w:t>CatBoost</w:t>
+      </w:r>
+      <w:proofErr w:type="spellEnd"/>
+      <w:r>
+        <w:t xml:space="preserve"> encoder works as </w:t>
+      </w:r>
+      <w:proofErr w:type="gramStart"/>
+      <w:r>
+        <w:t>a</w:t>
+      </w:r>
+      <w:proofErr w:type="gramEnd"/>
+      <w:r>
+        <w:t xml:space="preserve"> encoding that replaces the features’ categories with a metric derived from the target… in contrast to typical Target Encoding, the </w:t>
+      </w:r>
+      <w:proofErr w:type="spellStart"/>
+      <w:r>
+        <w:t>CatBoost</w:t>
+      </w:r>
+      <w:proofErr w:type="spellEnd"/>
+      <w:r>
+        <w:t xml:space="preserve"> encoder reduces target leakage</w:t>
+      </w:r>
+    </w:p>
+    <w:p>
+      <w:pPr>
+        <w:pStyle w:val="ListParagraph"/>
+        <w:numPr>
+          <w:ilvl w:val="1"/>
+          <w:numId w:val="1"/>
+        </w:numPr>
+      </w:pPr>
+      <w:r>
+        <w:t>It directly works with regression and binary outcomes</w:t>
+      </w:r>
+    </w:p>
+    <w:p>
+      <w:pPr>
+        <w:pStyle w:val="ListParagraph"/>
+        <w:numPr>
+          <w:ilvl w:val="1"/>
+          <w:numId w:val="1"/>
+        </w:numPr>
+      </w:pPr>
+      <w:r>
+        <w:t xml:space="preserve">For multiclass outcomes, </w:t>
+      </w:r>
+      <w:r>
+        <w:t>need Target Encoding</w:t>
+      </w:r>
+    </w:p>
+    <w:p>
+      <w:pPr>
+        <w:pStyle w:val="ListParagraph"/>
+        <w:numPr>
+          <w:ilvl w:val="1"/>
+          <w:numId w:val="1"/>
+        </w:numPr>
+      </w:pPr>
+      <w:r>
+        <w:t>One-hot encoding (w/ a “other” bucket) has the best performance over all model types (regression, binary and multiclass classification) and provides more specific feature information about subgroups</w:t>
+      </w:r>
+    </w:p>
+    <w:p>
+      <w:pPr>
+        <w:pStyle w:val="ListParagraph"/>
+        <w:numPr>
+          <w:ilvl w:val="0"/>
+          <w:numId w:val="1"/>
+        </w:numPr>
+      </w:pPr>
+      <w:r>
+        <w:t>Then throw features into linear regression</w:t>
       </w:r>
     </w:p>
     <w:p/>
     <w:p>
-      <w:r>
-        <w:t>Encoding categorical features:</w:t>
-      </w:r>
-    </w:p>
-    <w:p>
-      <w:pPr>
-        <w:pStyle w:val="ListParagraph"/>
-        <w:numPr>
-          <w:ilvl w:val="0"/>
-          <w:numId w:val="1"/>
-        </w:numPr>
-      </w:pPr>
-      <w:r>
-        <w:t>Issue: many categories in your data</w:t>
-      </w:r>
-    </w:p>
-    <w:p>
-      <w:pPr>
-        <w:pStyle w:val="ListParagraph"/>
-        <w:numPr>
-          <w:ilvl w:val="0"/>
-          <w:numId w:val="1"/>
-        </w:numPr>
-      </w:pPr>
-      <w:r>
-        <w:t>Resampling might miss some of the unique categories – those could lead to columns containing all 0s which would cause errors</w:t>
-      </w:r>
-    </w:p>
-    <w:p>
-      <w:pPr>
-        <w:pStyle w:val="ListParagraph"/>
-        <w:numPr>
-          <w:ilvl w:val="0"/>
-          <w:numId w:val="1"/>
-        </w:numPr>
-      </w:pPr>
-      <w:r>
-        <w:t>An “other” category can be used based on what categories in the training set might lead to all-zero columns during resampling</w:t>
-      </w:r>
-    </w:p>
-    <w:p>
-      <w:pPr>
-        <w:pStyle w:val="ListParagraph"/>
-        <w:numPr>
-          <w:ilvl w:val="0"/>
-          <w:numId w:val="1"/>
-        </w:numPr>
-      </w:pPr>
-      <w:r>
-        <w:t>Hash Encoding – could lead to confounding/aliasing</w:t>
-      </w:r>
-    </w:p>
-    <w:p>
-      <w:pPr>
-        <w:pStyle w:val="ListParagraph"/>
-        <w:numPr>
-          <w:ilvl w:val="0"/>
-          <w:numId w:val="1"/>
-        </w:numPr>
-      </w:pPr>
-      <w:r>
-        <w:t>Likelihood Encoding – could lead to overfitting</w:t>
-      </w:r>
-    </w:p>
-    <w:p>
-      <w:pPr>
-        <w:pStyle w:val="ListParagraph"/>
-        <w:numPr>
-          <w:ilvl w:val="0"/>
-          <w:numId w:val="1"/>
-        </w:numPr>
-      </w:pPr>
-      <w:r>
-        <w:t>Ordered categories should be given numerical encodings that correspond to the differences between each rank</w:t>
-      </w:r>
-    </w:p>
-    <w:p>
-      <w:pPr>
-        <w:pStyle w:val="ListParagraph"/>
-        <w:numPr>
-          <w:ilvl w:val="0"/>
-          <w:numId w:val="1"/>
-        </w:numPr>
-      </w:pPr>
-      <w:r>
-        <w:t>CatBoost has interaction feature that can be used for further interpretability – will investigate</w:t>
-      </w:r>
-    </w:p>
+      <w:proofErr w:type="spellStart"/>
+      <w:r>
+        <w:t>AirBNB</w:t>
+      </w:r>
+      <w:proofErr w:type="spellEnd"/>
+      <w:r>
+        <w:t xml:space="preserve"> data</w:t>
+      </w:r>
+    </w:p>
+    <w:p>
+      <w:proofErr w:type="spellStart"/>
+      <w:r>
+        <w:t>CatBoost</w:t>
+      </w:r>
+      <w:proofErr w:type="spellEnd"/>
+      <w:r>
+        <w:t xml:space="preserve"> encoder, regression target variable, outliers removed:</w:t>
+      </w:r>
+    </w:p>
+    <w:p>
+      <w:r>
+        <w:t xml:space="preserve">R^2 </w:t>
+      </w:r>
+      <w:r>
+        <w:t>Train: 67%, Test: 45% for regular linear regression… a significant improvement on just continuous data</w:t>
+      </w:r>
+      <w:r>
+        <w:t xml:space="preserve">. </w:t>
+      </w:r>
+    </w:p>
+    <w:p>
+      <w:r>
+        <w:t xml:space="preserve">Grouping rare categories into “other” turns this into train: 68%, test: 38% (overfitting). </w:t>
+      </w:r>
+    </w:p>
+    <w:p>
+      <w:r>
+        <w:t>Train: 62%, Test: 43% for randomized lasso regression.</w:t>
+      </w:r>
+    </w:p>
+    <w:p>
+      <w:r>
+        <w:t xml:space="preserve">These still aren’t great… but we previously had significantly lower train/test scores. </w:t>
+      </w:r>
+    </w:p>
+    <w:p>
+      <w:r>
+        <w:t>All models tend to have similar top features (different order but same features).</w:t>
+      </w:r>
+    </w:p>
+    <w:p>
+      <w:r>
+        <w:rPr>
+          <w:noProof/>
+        </w:rPr>
+        <w:lastRenderedPageBreak/>
+        <w:drawing>
+          <wp:inline distT="0" distB="0" distL="0" distR="0" wp14:anchorId="3A728364" wp14:editId="685D0363">
+            <wp:extent cx="5943600" cy="3756025"/>
+            <wp:effectExtent l="0" t="0" r="0" b="0"/>
+            <wp:docPr id="832444293" name="Picture 1" descr="A graph showing a line graph&#10;&#10;Description automatically generated with medium confidence"/>
+            <wp:cNvGraphicFramePr>
+              <a:graphicFrameLocks xmlns:a="http://schemas.openxmlformats.org/drawingml/2006/main" noChangeAspect="1"/>
+            </wp:cNvGraphicFramePr>
+            <a:graphic xmlns:a="http://schemas.openxmlformats.org/drawingml/2006/main">
+              <a:graphicData uri="http://schemas.openxmlformats.org/drawingml/2006/picture">
+                <pic:pic xmlns:pic="http://schemas.openxmlformats.org/drawingml/2006/picture">
+                  <pic:nvPicPr>
+                    <pic:cNvPr id="832444293" name="Picture 1" descr="A graph showing a line graph&#10;&#10;Description automatically generated with medium confidence"/>
+                    <pic:cNvPicPr/>
+                  </pic:nvPicPr>
+                  <pic:blipFill>
+                    <a:blip r:embed="rId5"/>
+                    <a:stretch>
+                      <a:fillRect/>
+                    </a:stretch>
+                  </pic:blipFill>
+                  <pic:spPr>
+                    <a:xfrm>
+                      <a:off x="0" y="0"/>
+                      <a:ext cx="5943600" cy="3756025"/>
+                    </a:xfrm>
+                    <a:prstGeom prst="rect">
+                      <a:avLst/>
+                    </a:prstGeom>
+                  </pic:spPr>
+                </pic:pic>
+              </a:graphicData>
+            </a:graphic>
+          </wp:inline>
+        </w:drawing>
+      </w:r>
+    </w:p>
+    <w:p>
+      <w:r>
+        <w:t xml:space="preserve">Our models have high variance (large gap between train and test scores), so </w:t>
+      </w:r>
+      <w:proofErr w:type="gramStart"/>
+      <w:r>
+        <w:t>improve</w:t>
+      </w:r>
+      <w:proofErr w:type="gramEnd"/>
+      <w:r>
+        <w:t xml:space="preserve"> the model performance, we’d most likely need to add more data or try bagging methods. </w:t>
+      </w:r>
+    </w:p>
+    <w:p>
+      <w:r>
+        <w:t xml:space="preserve">I had also used </w:t>
+      </w:r>
+      <w:proofErr w:type="spellStart"/>
+      <w:r>
+        <w:t>CatBoost</w:t>
+      </w:r>
+      <w:proofErr w:type="spellEnd"/>
+      <w:r>
+        <w:t xml:space="preserve"> in the past as another type of predictive model. I explored </w:t>
+      </w:r>
+      <w:proofErr w:type="spellStart"/>
+      <w:r>
+        <w:t>CatBoost</w:t>
+      </w:r>
+      <w:proofErr w:type="spellEnd"/>
+      <w:r>
+        <w:t xml:space="preserve"> again, but this time with SHAP plots for each variable as well.</w:t>
+      </w:r>
+    </w:p>
+    <w:p>
+      <w:r>
+        <w:rPr>
+          <w:noProof/>
+        </w:rPr>
+        <w:lastRenderedPageBreak/>
+        <w:drawing>
+          <wp:inline distT="0" distB="0" distL="0" distR="0" wp14:anchorId="33AD893D" wp14:editId="532F625E">
+            <wp:extent cx="5943600" cy="7019925"/>
+            <wp:effectExtent l="0" t="0" r="0" b="9525"/>
+            <wp:docPr id="1990441649" name="Picture 1" descr="A screen shot of a graph&#10;&#10;Description automatically generated"/>
+            <wp:cNvGraphicFramePr>
+              <a:graphicFrameLocks xmlns:a="http://schemas.openxmlformats.org/drawingml/2006/main" noChangeAspect="1"/>
+            </wp:cNvGraphicFramePr>
+            <a:graphic xmlns:a="http://schemas.openxmlformats.org/drawingml/2006/main">
+              <a:graphicData uri="http://schemas.openxmlformats.org/drawingml/2006/picture">
+                <pic:pic xmlns:pic="http://schemas.openxmlformats.org/drawingml/2006/picture">
+                  <pic:nvPicPr>
+                    <pic:cNvPr id="1990441649" name="Picture 1" descr="A screen shot of a graph&#10;&#10;Description automatically generated"/>
+                    <pic:cNvPicPr/>
+                  </pic:nvPicPr>
+                  <pic:blipFill>
+                    <a:blip r:embed="rId6"/>
+                    <a:stretch>
+                      <a:fillRect/>
+                    </a:stretch>
+                  </pic:blipFill>
+                  <pic:spPr>
+                    <a:xfrm>
+                      <a:off x="0" y="0"/>
+                      <a:ext cx="5943600" cy="7019925"/>
+                    </a:xfrm>
+                    <a:prstGeom prst="rect">
+                      <a:avLst/>
+                    </a:prstGeom>
+                  </pic:spPr>
+                </pic:pic>
+              </a:graphicData>
+            </a:graphic>
+          </wp:inline>
+        </w:drawing>
+      </w:r>
+    </w:p>
+    <w:p>
+      <w:r>
+        <w:t xml:space="preserve">This plot shows us the continuous variables and what impact they have on the prediction. A positive SHAP value corresponds to a positive prediction and vice versa. We can see that low </w:t>
+      </w:r>
+      <w:proofErr w:type="gramStart"/>
+      <w:r>
+        <w:t>accommodates</w:t>
+      </w:r>
+      <w:proofErr w:type="gramEnd"/>
+      <w:r>
+        <w:t xml:space="preserve"> values correspond to a low price, for example.</w:t>
+      </w:r>
+    </w:p>
+    <w:p>
+      <w:r>
+        <w:rPr>
+          <w:noProof/>
+        </w:rPr>
+        <w:lastRenderedPageBreak/>
+        <w:drawing>
+          <wp:inline distT="0" distB="0" distL="0" distR="0" wp14:anchorId="4B2197A0" wp14:editId="5EDD3F2C">
+            <wp:extent cx="5206349" cy="5079365"/>
+            <wp:effectExtent l="0" t="0" r="0" b="6985"/>
+            <wp:docPr id="244617995" name="Picture 1" descr="A graph with blue dots&#10;&#10;Description automatically generated"/>
+            <wp:cNvGraphicFramePr>
+              <a:graphicFrameLocks xmlns:a="http://schemas.openxmlformats.org/drawingml/2006/main" noChangeAspect="1"/>
+            </wp:cNvGraphicFramePr>
+            <a:graphic xmlns:a="http://schemas.openxmlformats.org/drawingml/2006/main">
+              <a:graphicData uri="http://schemas.openxmlformats.org/drawingml/2006/picture">
+                <pic:pic xmlns:pic="http://schemas.openxmlformats.org/drawingml/2006/picture">
+                  <pic:nvPicPr>
+                    <pic:cNvPr id="244617995" name="Picture 1" descr="A graph with blue dots&#10;&#10;Description automatically generated"/>
+                    <pic:cNvPicPr/>
+                  </pic:nvPicPr>
+                  <pic:blipFill>
+                    <a:blip r:embed="rId7"/>
+                    <a:stretch>
+                      <a:fillRect/>
+                    </a:stretch>
+                  </pic:blipFill>
+                  <pic:spPr>
+                    <a:xfrm>
+                      <a:off x="0" y="0"/>
+                      <a:ext cx="5206349" cy="5079365"/>
+                    </a:xfrm>
+                    <a:prstGeom prst="rect">
+                      <a:avLst/>
+                    </a:prstGeom>
+                  </pic:spPr>
+                </pic:pic>
+              </a:graphicData>
+            </a:graphic>
+          </wp:inline>
+        </w:drawing>
+      </w:r>
+    </w:p>
+    <w:p>
+      <w:r>
+        <w:t>This plot shows us a similar breakdown for each category of a categorical variable. We can see that responding within a day tends to correspond with lower price predictions.</w:t>
+      </w:r>
+    </w:p>
+    <w:p>
+      <w:r>
+        <w:t xml:space="preserve">These values don’t tell us </w:t>
+      </w:r>
+      <w:r>
+        <w:t>precisely</w:t>
+      </w:r>
+      <w:r>
+        <w:t xml:space="preserve"> how one value </w:t>
+      </w:r>
+      <w:r>
+        <w:t>influences</w:t>
+      </w:r>
+      <w:r>
+        <w:t xml:space="preserve"> another (as in through linear regression) but are still interesting and can have a similar purpose. This also gives us the subgroup categorical variable breakdown we were looking for. </w:t>
+      </w:r>
+    </w:p>
+    <w:p>
+      <w:proofErr w:type="spellStart"/>
+      <w:r>
+        <w:t>CatBoost</w:t>
+      </w:r>
+      <w:proofErr w:type="spellEnd"/>
+      <w:r>
+        <w:t xml:space="preserve"> also has much higher train/test accuracy than our linear regression models. (High variance as well though which can usually be solved by adding more data or bagging.)</w:t>
+      </w:r>
+      <w:r>
+        <w:t xml:space="preserve"> </w:t>
+      </w:r>
+      <w:proofErr w:type="gramStart"/>
+      <w:r>
+        <w:t>Biggest</w:t>
+      </w:r>
+      <w:proofErr w:type="gramEnd"/>
+      <w:r>
+        <w:t xml:space="preserve"> issue with boosting models is sensitivity to outliers.</w:t>
+      </w:r>
+    </w:p>
+    <w:p>
+      <w:r>
+        <w:t>Train R-squared: 0.8650660575458691</w:t>
+      </w:r>
+    </w:p>
+    <w:p>
+      <w:r>
+        <w:t>Test R-squared: 0.5525345269338575</w:t>
+      </w:r>
+    </w:p>
+    <w:p>
+      <w:proofErr w:type="gramStart"/>
+      <w:r>
+        <w:t>Added in</w:t>
+      </w:r>
+      <w:proofErr w:type="gramEnd"/>
+      <w:r>
+        <w:t xml:space="preserve"> </w:t>
+      </w:r>
+      <w:proofErr w:type="spellStart"/>
+      <w:r>
+        <w:t>CatBoost</w:t>
+      </w:r>
+      <w:proofErr w:type="spellEnd"/>
+      <w:r>
+        <w:t xml:space="preserve"> and Logistic Regression for categorical variables as well. Still want to investigate anomaly detection with logistic regression… was having some trouble with that.</w:t>
+      </w:r>
+    </w:p>
+    <w:p>
+      <w:r>
+        <w:lastRenderedPageBreak/>
+        <w:t xml:space="preserve">Logistic </w:t>
+      </w:r>
+      <w:proofErr w:type="spellStart"/>
+      <w:r>
+        <w:t>RegressionCV</w:t>
+      </w:r>
+      <w:proofErr w:type="spellEnd"/>
+      <w:r>
+        <w:t xml:space="preserve"> takes a long time but has higher testing accuracy than </w:t>
+      </w:r>
+      <w:proofErr w:type="spellStart"/>
+      <w:r>
+        <w:t>CatBoost</w:t>
+      </w:r>
+      <w:proofErr w:type="spellEnd"/>
+      <w:r>
+        <w:t xml:space="preserve"> on the pet adoption dataset (82% vs. 80%). Both have a minimal gap between training and testing.</w:t>
+      </w:r>
+    </w:p>
+    <w:p>
+      <w:pPr>
+        <w:pStyle w:val="ListParagraph"/>
+        <w:numPr>
+          <w:ilvl w:val="0"/>
+          <w:numId w:val="1"/>
+        </w:numPr>
+      </w:pPr>
+      <w:r>
+        <w:t>Text/descriptions… can turn them into feature vectors using Word2Vec</w:t>
+      </w:r>
+    </w:p>
+    <w:p>
+      <w:pPr>
+        <w:pStyle w:val="ListParagraph"/>
+        <w:numPr>
+          <w:ilvl w:val="1"/>
+          <w:numId w:val="1"/>
+        </w:numPr>
+      </w:pPr>
+      <w:r>
+        <w:t>Then summing or averaging the feature vectors can often have pretty good results in terms of transforming them into continuous data</w:t>
+      </w:r>
+      <w:r>
+        <w:t xml:space="preserve"> that represents a document/blurb</w:t>
+      </w:r>
+    </w:p>
+    <w:p>
+      <w:pPr>
+        <w:pStyle w:val="ListParagraph"/>
+        <w:numPr>
+          <w:ilvl w:val="1"/>
+          <w:numId w:val="1"/>
+        </w:numPr>
+      </w:pPr>
+      <w:r>
+        <w:t>Then they can be incorporated into an existing regression model or other model and used!</w:t>
+      </w:r>
+    </w:p>
+    <w:p>
+      <w:pPr>
+        <w:pStyle w:val="ListParagraph"/>
+        <w:numPr>
+          <w:ilvl w:val="1"/>
+          <w:numId w:val="1"/>
+        </w:numPr>
+      </w:pPr>
+      <w:r>
+        <w:t>Can normalize the vectors and scale them if we aren’t interested in significance or consistency</w:t>
+      </w:r>
+    </w:p>
+    <w:p>
+      <w:pPr>
+        <w:pStyle w:val="ListParagraph"/>
+        <w:numPr>
+          <w:ilvl w:val="1"/>
+          <w:numId w:val="1"/>
+        </w:numPr>
+      </w:pPr>
+      <w:r>
+        <w:t>Doc2Vec also an option</w:t>
+      </w:r>
+      <w:r>
+        <w:t xml:space="preserve"> but more space and time is needed to properly train the model</w:t>
+      </w:r>
+    </w:p>
+    <w:p>
+      <w:r>
+        <w:t xml:space="preserve">Taking </w:t>
+      </w:r>
+      <w:proofErr w:type="spellStart"/>
+      <w:r>
+        <w:t>AirBNB</w:t>
+      </w:r>
+      <w:proofErr w:type="spellEnd"/>
+      <w:r>
+        <w:t xml:space="preserve"> descriptions and adding them as features in the linear regressions is NOT helpful: even reduces model accuracy in some cases (Linear Regression and Randomized Lasso both lost 2% on test). </w:t>
+      </w:r>
+    </w:p>
+    <w:p>
+      <w:r>
+        <w:t xml:space="preserve">Just </w:t>
+      </w:r>
+      <w:proofErr w:type="spellStart"/>
+      <w:r>
+        <w:t>AirBNB</w:t>
+      </w:r>
+      <w:proofErr w:type="spellEnd"/>
+      <w:r>
+        <w:t xml:space="preserve"> descriptions by themselves are also not helpful: Test accuracy is around .03% for all models and train accuracy is not much better.</w:t>
+      </w:r>
+    </w:p>
+    <w:p>
+      <w:r>
+        <w:t>---- NOTE: Regression on a count outcome requires Poisson Regression ----</w:t>
+      </w:r>
+    </w:p>
+    <w:p>
+      <w:r>
+        <w:t>Interested in seeing longer descriptions</w:t>
+      </w:r>
+      <w:r>
+        <w:t xml:space="preserve"> </w:t>
+      </w:r>
+      <w:r>
+        <w:t xml:space="preserve">– if that does better. </w:t>
+      </w:r>
+      <w:r>
+        <w:t>Interested in also seeing what happens if we run PCA on the description vectors to reduce their size even further.</w:t>
+      </w:r>
+    </w:p>
+    <w:p>
+      <w:hyperlink r:id="rId8" w:history="1">
+        <w:r>
+          <w:rPr>
+            <w:rStyle w:val="Hyperlink"/>
+          </w:rPr>
+          <w:t>https://www.kaggle.com/datasets/ravindrasinghrana/job-description-dataset</w:t>
+        </w:r>
+      </w:hyperlink>
+    </w:p>
+    <w:p>
+      <w:hyperlink r:id="rId9" w:history="1">
+        <w:r>
+          <w:rPr>
+            <w:rStyle w:val="Hyperlink"/>
+          </w:rPr>
+          <w:t>https://www.kaggle.com/datasets/anu0012/hotel-review?select=train.csv</w:t>
+        </w:r>
+      </w:hyperlink>
+    </w:p>
+    <w:p/>
+    <w:p>
+      <w:r>
+        <w:t>LLMs:</w:t>
+      </w:r>
+    </w:p>
+    <w:p>
+      <w:r>
+        <w:t>GPT 4o:</w:t>
+      </w:r>
+    </w:p>
+    <w:p>
+      <w:pPr>
+        <w:pStyle w:val="ListParagraph"/>
+        <w:numPr>
+          <w:ilvl w:val="0"/>
+          <w:numId w:val="1"/>
+        </w:numPr>
+      </w:pPr>
+      <w:r>
+        <w:t xml:space="preserve">Default is to use one-hot encoding even when that might blow up the size of the </w:t>
+      </w:r>
+      <w:proofErr w:type="spellStart"/>
+      <w:r>
+        <w:t>dataframe</w:t>
+      </w:r>
+      <w:proofErr w:type="spellEnd"/>
+    </w:p>
+    <w:p>
+      <w:pPr>
+        <w:pStyle w:val="ListParagraph"/>
+        <w:numPr>
+          <w:ilvl w:val="0"/>
+          <w:numId w:val="1"/>
+        </w:numPr>
+      </w:pPr>
+      <w:r>
+        <w:t xml:space="preserve">Prompted it to use </w:t>
+      </w:r>
+      <w:proofErr w:type="spellStart"/>
+      <w:r>
+        <w:t>category_encoders</w:t>
+      </w:r>
+      <w:proofErr w:type="spellEnd"/>
+      <w:r>
+        <w:t xml:space="preserve"> package… doesn’t have </w:t>
+      </w:r>
+      <w:proofErr w:type="spellStart"/>
+      <w:r>
+        <w:t>category_encoders</w:t>
+      </w:r>
+      <w:proofErr w:type="spellEnd"/>
+      <w:r>
+        <w:t xml:space="preserve"> installed (?) so tried to use ordinal encoding instead</w:t>
+      </w:r>
+    </w:p>
+    <w:p>
+      <w:pPr>
+        <w:pStyle w:val="ListParagraph"/>
+        <w:numPr>
+          <w:ilvl w:val="1"/>
+          <w:numId w:val="1"/>
+        </w:numPr>
+      </w:pPr>
+      <w:r>
+        <w:t>Tried to use target encoding at first though which would make sense</w:t>
+      </w:r>
+    </w:p>
+    <w:p>
+      <w:pPr>
+        <w:pStyle w:val="ListParagraph"/>
+        <w:numPr>
+          <w:ilvl w:val="0"/>
+          <w:numId w:val="1"/>
+        </w:numPr>
+      </w:pPr>
+      <w:r>
+        <w:t xml:space="preserve">Then tries to use a basic Decision Tree model </w:t>
+      </w:r>
+    </w:p>
+    <w:p>
+      <w:pPr>
+        <w:pStyle w:val="ListParagraph"/>
+        <w:numPr>
+          <w:ilvl w:val="0"/>
+          <w:numId w:val="1"/>
+        </w:numPr>
+      </w:pPr>
+      <w:r>
+        <w:t>Doesn’t have access to word2vec so uses scikit-learn library instead</w:t>
+      </w:r>
+    </w:p>
+    <w:p>
+      <w:pPr>
+        <w:pStyle w:val="ListParagraph"/>
+        <w:numPr>
+          <w:ilvl w:val="1"/>
+          <w:numId w:val="1"/>
+        </w:numPr>
+      </w:pPr>
+      <w:r>
+        <w:t>Word2Vec works better with larger documents as you can reduce dimensionality</w:t>
+      </w:r>
+    </w:p>
+    <w:p>
+      <w:pPr>
+        <w:pStyle w:val="ListParagraph"/>
+        <w:numPr>
+          <w:ilvl w:val="0"/>
+          <w:numId w:val="1"/>
+        </w:numPr>
+      </w:pPr>
+      <w:r>
+        <w:t>Uses a Random Forest model with about equivalent test accuracy</w:t>
+      </w:r>
+      <w:r>
+        <w:t xml:space="preserve"> as our linear regression model</w:t>
+      </w:r>
+      <w:r>
+        <w:t>: 42%</w:t>
+      </w:r>
+    </w:p>
+    <w:p/>
     <w:sectPr>
       <w:pgSz w:w="12240" w:h="15840"/>
       <w:pgMar w:top="1440" w:right="1440" w:bottom="1440" w:left="1440" w:header="720" w:footer="720" w:gutter="0"/>
@@ -1506,11 +2624,103 @@
       </w:rPr>
     </w:lvl>
   </w:abstractNum>
+  <w:abstractNum w:abstractNumId="2" w15:restartNumberingAfterBreak="0">
+    <w:nsid w:val="44B63B76"/>
+    <w:multiLevelType w:val="hybridMultilevel"/>
+    <w:tmpl w:val="691A6B52"/>
+    <w:lvl w:ilvl="0" w:tplc="EBA84BB2">
+      <w:start w:val="1"/>
+      <w:numFmt w:val="decimal"/>
+      <w:lvlText w:val="%1."/>
+      <w:lvlJc w:val="left"/>
+      <w:pPr>
+        <w:ind w:left="1080" w:hanging="360"/>
+      </w:pPr>
+      <w:rPr>
+        <w:rFonts w:hint="default"/>
+      </w:rPr>
+    </w:lvl>
+    <w:lvl w:ilvl="1" w:tplc="04090019" w:tentative="1">
+      <w:start w:val="1"/>
+      <w:numFmt w:val="lowerLetter"/>
+      <w:lvlText w:val="%2."/>
+      <w:lvlJc w:val="left"/>
+      <w:pPr>
+        <w:ind w:left="1800" w:hanging="360"/>
+      </w:pPr>
+    </w:lvl>
+    <w:lvl w:ilvl="2" w:tplc="0409001B" w:tentative="1">
+      <w:start w:val="1"/>
+      <w:numFmt w:val="lowerRoman"/>
+      <w:lvlText w:val="%3."/>
+      <w:lvlJc w:val="right"/>
+      <w:pPr>
+        <w:ind w:left="2520" w:hanging="180"/>
+      </w:pPr>
+    </w:lvl>
+    <w:lvl w:ilvl="3" w:tplc="0409000F" w:tentative="1">
+      <w:start w:val="1"/>
+      <w:numFmt w:val="decimal"/>
+      <w:lvlText w:val="%4."/>
+      <w:lvlJc w:val="left"/>
+      <w:pPr>
+        <w:ind w:left="3240" w:hanging="360"/>
+      </w:pPr>
+    </w:lvl>
+    <w:lvl w:ilvl="4" w:tplc="04090019" w:tentative="1">
+      <w:start w:val="1"/>
+      <w:numFmt w:val="lowerLetter"/>
+      <w:lvlText w:val="%5."/>
+      <w:lvlJc w:val="left"/>
+      <w:pPr>
+        <w:ind w:left="3960" w:hanging="360"/>
+      </w:pPr>
+    </w:lvl>
+    <w:lvl w:ilvl="5" w:tplc="0409001B" w:tentative="1">
+      <w:start w:val="1"/>
+      <w:numFmt w:val="lowerRoman"/>
+      <w:lvlText w:val="%6."/>
+      <w:lvlJc w:val="right"/>
+      <w:pPr>
+        <w:ind w:left="4680" w:hanging="180"/>
+      </w:pPr>
+    </w:lvl>
+    <w:lvl w:ilvl="6" w:tplc="0409000F" w:tentative="1">
+      <w:start w:val="1"/>
+      <w:numFmt w:val="decimal"/>
+      <w:lvlText w:val="%7."/>
+      <w:lvlJc w:val="left"/>
+      <w:pPr>
+        <w:ind w:left="5400" w:hanging="360"/>
+      </w:pPr>
+    </w:lvl>
+    <w:lvl w:ilvl="7" w:tplc="04090019" w:tentative="1">
+      <w:start w:val="1"/>
+      <w:numFmt w:val="lowerLetter"/>
+      <w:lvlText w:val="%8."/>
+      <w:lvlJc w:val="left"/>
+      <w:pPr>
+        <w:ind w:left="6120" w:hanging="360"/>
+      </w:pPr>
+    </w:lvl>
+    <w:lvl w:ilvl="8" w:tplc="0409001B" w:tentative="1">
+      <w:start w:val="1"/>
+      <w:numFmt w:val="lowerRoman"/>
+      <w:lvlText w:val="%9."/>
+      <w:lvlJc w:val="right"/>
+      <w:pPr>
+        <w:ind w:left="6840" w:hanging="180"/>
+      </w:pPr>
+    </w:lvl>
+  </w:abstractNum>
   <w:num w:numId="1" w16cid:durableId="189682985">
     <w:abstractNumId w:val="1"/>
   </w:num>
   <w:num w:numId="2" w16cid:durableId="441151401">
     <w:abstractNumId w:val="0"/>
+  </w:num>
+  <w:num w:numId="3" w16cid:durableId="1614626986">
+    <w:abstractNumId w:val="2"/>
   </w:num>
 </w:numbering>
 </file>
@@ -2432,6 +3642,41 @@
       <w:spacing w:val="5"/>
     </w:rPr>
   </w:style>
+  <w:style w:type="character" w:styleId="Hyperlink">
+    <w:name w:val="Hyperlink"/>
+    <w:basedOn w:val="DefaultParagraphFont"/>
+    <w:uiPriority w:val="99"/>
+    <w:unhideWhenUsed/>
+    <w:rsid w:val="00DA29F5"/>
+    <w:rPr>
+      <w:color w:val="467886" w:themeColor="hyperlink"/>
+      <w:u w:val="single"/>
+    </w:rPr>
+  </w:style>
+  <w:style w:type="character" w:styleId="UnresolvedMention">
+    <w:name w:val="Unresolved Mention"/>
+    <w:basedOn w:val="DefaultParagraphFont"/>
+    <w:uiPriority w:val="99"/>
+    <w:semiHidden/>
+    <w:unhideWhenUsed/>
+    <w:rsid w:val="00DA29F5"/>
+    <w:rPr>
+      <w:color w:val="605E5C"/>
+      <w:shd w:val="clear" w:color="auto" w:fill="E1DFDD"/>
+    </w:rPr>
+  </w:style>
+  <w:style w:type="character" w:styleId="FollowedHyperlink">
+    <w:name w:val="FollowedHyperlink"/>
+    <w:basedOn w:val="DefaultParagraphFont"/>
+    <w:uiPriority w:val="99"/>
+    <w:semiHidden/>
+    <w:unhideWhenUsed/>
+    <w:rsid w:val="0037164B"/>
+    <w:rPr>
+      <w:color w:val="96607D" w:themeColor="followedHyperlink"/>
+      <w:u w:val="single"/>
+    </w:rPr>
+  </w:style>
 </w:styles>
 </file>
 

</xml_diff>